<commit_message>
complete MSPM0G3507 vehicle test stack
</commit_message>
<xml_diff>
--- a/北京化工大学信息学院卓越工程师实验班选拔报名表_已填写个人简介.docx
+++ b/北京化工大学信息学院卓越工程师实验班选拔报名表_已填写个人简介.docx
@@ -374,7 +374,49 @@
                 <w:rFonts w:ascii="Times New Roman" w:eastAsia="宋体" w:hAnsi="Times New Roman"/>
                 <w:sz w:val="24"/>
               </w:rPr>
-              <w:t>本人注重将理论学习与工程实践相结合，曾获蓝桥杯全国一等奖。参加全国大学生智能汽车竞赛电磁赛道，主要负责硬件部分，完成电路方案设计、</w:t>
+              <w:t>本人注重将理论学习与工程实践相结合，曾获蓝桥杯全国一等奖</w:t>
+            </w:r>
+            <w:r>
+              <w:rPr>
+                <w:rFonts w:ascii="Times New Roman" w:eastAsia="宋体" w:hAnsi="Times New Roman" w:hint="eastAsia"/>
+                <w:sz w:val="24"/>
+              </w:rPr>
+              <w:t>，</w:t>
+            </w:r>
+            <w:r>
+              <w:rPr>
+                <w:rFonts w:ascii="Times New Roman" w:eastAsia="宋体" w:hAnsi="Times New Roman" w:hint="eastAsia"/>
+                <w:sz w:val="24"/>
+              </w:rPr>
+              <w:t>LED</w:t>
+            </w:r>
+            <w:r>
+              <w:rPr>
+                <w:rFonts w:ascii="Times New Roman" w:eastAsia="宋体" w:hAnsi="Times New Roman" w:hint="eastAsia"/>
+                <w:sz w:val="24"/>
+              </w:rPr>
+              <w:t>点阵屏制作大赛一等奖，实用新型专利一项</w:t>
+            </w:r>
+            <w:r>
+              <w:rPr>
+                <w:rFonts w:ascii="Times New Roman" w:eastAsia="宋体" w:hAnsi="Times New Roman"/>
+                <w:sz w:val="24"/>
+              </w:rPr>
+              <w:t>。参加全国大学生智能汽车竞赛</w:t>
+            </w:r>
+            <w:r>
+              <w:rPr>
+                <w:rFonts w:ascii="Times New Roman" w:eastAsia="宋体" w:hAnsi="Times New Roman" w:hint="eastAsia"/>
+                <w:sz w:val="24"/>
+              </w:rPr>
+              <w:t>飞檐走壁</w:t>
+            </w:r>
+            <w:r>
+              <w:rPr>
+                <w:rFonts w:ascii="Times New Roman" w:eastAsia="宋体" w:hAnsi="Times New Roman"/>
+                <w:sz w:val="24"/>
+              </w:rPr>
+              <w:t>赛道，主要负责硬件部分，完成电路方案设计、</w:t>
             </w:r>
             <w:r>
               <w:rPr>
@@ -480,6 +522,20 @@
                 <w:sz w:val="24"/>
               </w:rPr>
               <w:t>STM32</w:t>
+            </w:r>
+            <w:r>
+              <w:rPr>
+                <w:rFonts w:ascii="Times New Roman" w:eastAsia="宋体" w:hAnsi="Times New Roman" w:hint="eastAsia"/>
+                <w:sz w:val="24"/>
+              </w:rPr>
+              <w:t>、</w:t>
+            </w:r>
+            <w:r>
+              <w:rPr>
+                <w:rFonts w:ascii="Times New Roman" w:eastAsia="宋体" w:hAnsi="Times New Roman" w:hint="eastAsia"/>
+                <w:sz w:val="24"/>
+              </w:rPr>
+              <w:t>ESP32</w:t>
             </w:r>
             <w:r>
               <w:rPr>

</xml_diff>